<commit_message>
modified exhibition report dox
</commit_message>
<xml_diff>
--- a/Report on exhibition.docx
+++ b/Report on exhibition.docx
@@ -78,8 +78,6 @@
         </w:rPr>
         <w:t>.</w:t>
       </w:r>
-      <w:bookmarkStart w:id="0" w:name="_GoBack"/>
-      <w:bookmarkEnd w:id="0"/>
     </w:p>
     <w:p>
       <w:r>
@@ -284,9 +282,8 @@
             </w:r>
           </w:p>
           <w:p>
-            <w:r>
-              <w:t>s</w:t>
-            </w:r>
+            <w:bookmarkStart w:id="0" w:name="_GoBack"/>
+            <w:bookmarkEnd w:id="0"/>
           </w:p>
           <w:p>
             <w:pPr>
@@ -332,7 +329,16 @@
     <w:p/>
     <w:p>
       <w:r>
-        <w:t xml:space="preserve">We are looking forward to continued collaboration with Johnson Grammar </w:t>
+        <w:t xml:space="preserve">We </w:t>
+      </w:r>
+      <w:r>
+        <w:t>will continue</w:t>
+      </w:r>
+      <w:r>
+        <w:t xml:space="preserve"> </w:t>
+      </w:r>
+      <w:r>
+        <w:t xml:space="preserve">to continued collaboration with Johnson Grammar </w:t>
       </w:r>
       <w:r>
         <w:t>School, work</w:t>

</xml_diff>

<commit_message>
added the report on exhibition file and scripts file was modified for the error there in the scripts
</commit_message>
<xml_diff>
--- a/Report on exhibition.docx
+++ b/Report on exhibition.docx
@@ -281,10 +281,7 @@
               <w:t>10. Flappy Bird (Scratch Project)</w:t>
             </w:r>
           </w:p>
-          <w:p>
-            <w:bookmarkStart w:id="0" w:name="_GoBack"/>
-            <w:bookmarkEnd w:id="0"/>
-          </w:p>
+          <w:p/>
           <w:p>
             <w:pPr>
               <w:rPr>
@@ -338,7 +335,15 @@
         <w:t xml:space="preserve"> </w:t>
       </w:r>
       <w:r>
-        <w:t xml:space="preserve">to continued collaboration with Johnson Grammar </w:t>
+        <w:t xml:space="preserve">to </w:t>
+      </w:r>
+      <w:r>
+        <w:t>collaborate</w:t>
+      </w:r>
+      <w:bookmarkStart w:id="0" w:name="_GoBack"/>
+      <w:bookmarkEnd w:id="0"/>
+      <w:r>
+        <w:t xml:space="preserve"> with Johnson Grammar </w:t>
       </w:r>
       <w:r>
         <w:t>School, work</w:t>

</xml_diff>